<commit_message>
Add 【待核】 markers on uncertain reference items [8][12][14][33] per submission checklist
</commit_message>
<xml_diff>
--- a/大语言模型在中医药领域评测研究0617_润色版.docx
+++ b/大语言模型在中医药领域评测研究0617_润色版.docx
@@ -2274,7 +2274,7 @@
           <w:b w:val="0"/>
           <w:sz w:val="21"/>
         </w:rPr>
-        <w:t>[8] NIE G X, ZHOU Y L, XU D Y, et al. DiagX-DT: diagnostic exclusion reasoning with dialectical thinking for traditional Chinese medicine in large language models[J]. Journal of King Saud University-Computer and Information Sciences, 2025, 37(5): 102.</w:t>
+        <w:t>[8] NIE G X, ZHOU Y L, XU D Y, et al. DiagX-DT: diagnostic exclusion reasoning with dialectical thinking for traditional Chinese medicine in large language models[J]. Journal of King Saud University-Computer and Information Sciences, 2025, 37(5): 102.【待核：页码/文章编号，检索题录无页码】</w:t>
       </w:r>
     </w:p>
     <w:p>
@@ -2334,7 +2334,7 @@
           <w:b w:val="0"/>
           <w:sz w:val="21"/>
         </w:rPr>
-        <w:t>[12] WANG B F, LU Y W, WANG Z, et al. TCMEval-PA: a question-answering benchmark dataset for the prescription audit of traditional Chinese medicine[J]. Scientific Data, 2025, 12: 79.</w:t>
+        <w:t>[12] WANG B F, LU Y W, WANG Z, et al. TCMEval-PA: a question-answering benchmark dataset for the prescription audit of traditional Chinese medicine[J]. Scientific Data, 2025, 12: 79.【待核：卷号，检索题录(Zotero)记为13(1)】</w:t>
       </w:r>
     </w:p>
     <w:p>
@@ -2364,7 +2364,7 @@
           <w:b w:val="0"/>
           <w:sz w:val="21"/>
         </w:rPr>
-        <w:t>[14] 赵尚卿, 兰曼, 柏晓鹏, 等. 负屃：古汉语文本理解与生成能力评测基准[J]. 中文信息学报, 2026.</w:t>
+        <w:t>[14] 赵尚卿, 兰曼, 柏晓鹏, 等. 负屃：古汉语文本理解与生成能力评测基准[J]. 中文信息学报, 2026【待核：卷(期):页码，未见于检索题录】.</w:t>
       </w:r>
     </w:p>
     <w:p>
@@ -2599,7 +2599,7 @@
     </w:p>
     <w:p>
       <w:r>
-        <w:t>[33] XU Q, ZHAO Z H, LIU W W, et al. A character-level convolutional recurrent interaction network for joint traditional Chinese medicine clinical named entity recognition and relation extraction[J]. Artificial Intelligence in Medicine, 2026.</w:t>
+        <w:t>[33] XU Q, ZHAO Z H, LIU W W, et al. A character-level convolutional recurrent interaction network for joint traditional Chinese medicine clinical named entity recognition and relation extraction[J]. Artificial Intelligence in Medicine, 2026【待核：卷(期):页码，未见于检索题录】.</w:t>
       </w:r>
     </w:p>
     <w:p>

</xml_diff>